<commit_message>
Update AMSA agreement and add onboarding checklist
</commit_message>
<xml_diff>
--- a/AMSA_Service_Agreement_Editable.docx
+++ b/AMSA_Service_Agreement_Editable.docx
@@ -45,7 +45,7 @@
           <w:color w:val="5F5A53"/>
           <w:sz w:val="25"/>
         </w:rPr>
-        <w:t>A clear six-month working plan with a client-friendly cancellation right.</w:t>
+        <w:t>A clear 12-month working plan with a client-friendly cancellation right.</w:t>
       </w:r>
     </w:p>
     <w:tbl>
@@ -779,7 +779,29 @@
           <w:color w:val="000000"/>
           <w:sz w:val="21"/>
         </w:rPr>
-        <w:t>The service is planned as a six-month SEO, content, social and website programme at EUR 350 per month, plus VAT only if legally chargeable. Six months is the recommended minimum measurement period for SEO; it does not remove the Client's right to end the agreement under section 8.</w:t>
+        <w:t>The service is planned as a 12-month SEO, content, social and website programme at EUR 350 per month, plus VAT only if legally chargeable. Twelve months supports continuous research, publishing, indexing and refinement across complete SEO cycles. The Client retains the right to end the agreement under section 8.</w:t>
+      </w:r>
+    </w:p>
+    <w:p>
+      <w:r>
+        <w:rPr>
+          <w:rFonts w:ascii="Aptos" w:hAnsi="Aptos"/>
+          <w:b/>
+          <w:i w:val="0"/>
+          <w:color w:val="000000"/>
+          <w:sz w:val="21"/>
+        </w:rPr>
+        <w:t>Price flexibility.</w:t>
+      </w:r>
+      <w:r>
+        <w:rPr>
+          <w:rFonts w:ascii="Aptos" w:hAnsi="Aptos"/>
+          <w:b w:val="0"/>
+          <w:i w:val="0"/>
+          <w:color w:val="000000"/>
+          <w:sz w:val="21"/>
+        </w:rPr>
+        <w:t xml:space="preserve"> The monthly fee may move up or down when AMSA and 404200 agree verbally, including when scope, workload, platform costs or circumstances beyond either party's reasonable control change. 404200 will confirm the agreed amount and effective date by email before it appears on an invoice.</w:t>
       </w:r>
     </w:p>
     <w:p>
@@ -1579,7 +1601,7 @@
           <w:color w:val="000000"/>
           <w:sz w:val="21"/>
         </w:rPr>
-        <w:t>Both parties keep non-public project, business and access information confidential and use it only for this engagement. Any change to the fee, main scope or payment choice must be agreed in writing. Email is sufficient for routine priorities, approvals and scheduling.</w:t>
+        <w:t>Both parties keep non-public project, business and access information confidential and use it only for this engagement. Fee adjustments follow the shared verbal agreement and email record described in section 2. Any change to the main scope or payment choice must be agreed in writing. Email is sufficient for routine priorities, approvals and scheduling.</w:t>
       </w:r>
     </w:p>
     <w:p>
@@ -2019,7 +2041,7 @@
             <w:drawing>
               <wp:inline xmlns:a="http://schemas.openxmlformats.org/drawingml/2006/main" xmlns:pic="http://schemas.openxmlformats.org/drawingml/2006/picture">
                 <wp:extent cx="274320" cy="153010"/>
-                <wp:docPr id="1" name="Picture 1"/>
+                <wp:docPr id="1" name="Picture 1" descr="404200 brand mark" title="404200 brand mark"/>
                 <wp:cNvGraphicFramePr>
                   <a:graphicFrameLocks noChangeAspect="1"/>
                 </wp:cNvGraphicFramePr>
@@ -2071,7 +2093,7 @@
             <w:drawing>
               <wp:inline xmlns:a="http://schemas.openxmlformats.org/drawingml/2006/main" xmlns:pic="http://schemas.openxmlformats.org/drawingml/2006/picture">
                 <wp:extent cx="1508760" cy="646881"/>
-                <wp:docPr id="2" name="Picture 2"/>
+                <wp:docPr id="2" name="Picture 2" descr="404200 logo" title="404200 logo"/>
                 <wp:cNvGraphicFramePr>
                   <a:graphicFrameLocks noChangeAspect="1"/>
                 </wp:cNvGraphicFramePr>
@@ -2162,7 +2184,7 @@
       <w:drawing>
         <wp:inline xmlns:a="http://schemas.openxmlformats.org/drawingml/2006/main" xmlns:pic="http://schemas.openxmlformats.org/drawingml/2006/picture">
           <wp:extent cx="841248" cy="360335"/>
-          <wp:docPr id="1" name="Picture 1"/>
+          <wp:docPr id="1" name="Picture 1" descr="404200 logo" title="404200 logo"/>
           <wp:cNvGraphicFramePr>
             <a:graphicFrameLocks noChangeAspect="1"/>
           </wp:cNvGraphicFramePr>

</xml_diff>